<commit_message>
Implement Claude feedback refinements
</commit_message>
<xml_diff>
--- a/handoff/Legal_Writing_Structure_Coach_Handoff.docx
+++ b/handoff/Legal_Writing_Structure_Coach_Handoff.docx
@@ -453,6 +453,14 @@
         <w:pStyle w:val="ListBullet"/>
       </w:pPr>
       <w:r>
+        <w:t>Pytest regression suite: python -m pytest.</w:t>
+      </w:r>
+    </w:p>
+    <w:p>
+      <w:pPr>
+        <w:pStyle w:val="ListBullet"/>
+      </w:pPr>
+      <w:r>
         <w:t>JS syntax check: bundled Node runtime with node --check app/static/app.js.</w:t>
       </w:r>
     </w:p>
@@ -461,7 +469,7 @@
         <w:pStyle w:val="ListBullet"/>
       </w:pPr>
       <w:r>
-        <w:t>Live smoke path: /analyze returns training fields and /export produces a valid annotated DOCX.</w:t>
+        <w:t>Live smoke path: paste-demo analysis renders highlights, click/tap sentence details, RTF upload tab, and export-ready results.</w:t>
       </w:r>
     </w:p>
     <w:p>

</xml_diff>

<commit_message>
Complete Claude review cleanup
</commit_message>
<xml_diff>
--- a/handoff/Legal_Writing_Structure_Coach_Handoff.docx
+++ b/handoff/Legal_Writing_Structure_Coach_Handoff.docx
@@ -461,6 +461,14 @@
         <w:pStyle w:val="ListBullet"/>
       </w:pPr>
       <w:r>
+        <w:t>Pytest collection check: python -m pytest --co -q.</w:t>
+      </w:r>
+    </w:p>
+    <w:p>
+      <w:pPr>
+        <w:pStyle w:val="ListBullet"/>
+      </w:pPr>
+      <w:r>
         <w:t>JS syntax check: bundled Node runtime with node --check app/static/app.js.</w:t>
       </w:r>
     </w:p>
@@ -469,7 +477,7 @@
         <w:pStyle w:val="ListBullet"/>
       </w:pPr>
       <w:r>
-        <w:t>Live smoke path: paste-demo analysis renders highlights, click/tap sentence details, RTF upload tab, and export-ready results.</w:t>
+        <w:t>Live smoke path: paste-demo analysis renders highlights, click/tap sentence details, RTF upload tab, drag-and-drop upload zones, and export-ready results.</w:t>
       </w:r>
     </w:p>
     <w:p>

</xml_diff>